<commit_message>
Finish L2 (leakage experiment, notebook, explainer); public-repo data fetch over HTTPS
Leakage experiment: flow-level split reports MAE_log 0.127 vs true 0.399 (3.15x optimistic); scenario-level split 0.358 vs 0.410. L2 notebook and figures, explainer 02_problematique.md, data_sync fetch without gh auth, work plan updated, journal D2.5-D2.7, local path removed from notebook output.
</commit_message>
<xml_diff>
--- a/docs/plan_de_travail_equipe.docx
+++ b/docs/plan_de_travail_equipe.docx
@@ -49,7 +49,7 @@
     <w:sdt>
       <w:sdtPr>
         <w:alias w:val="Sommaire"/>
-        <w:id w:val="-1358881002"/>
+        <w:id w:val="-16163150"/>
       </w:sdtPr>
       <w:sdtEndPr/>
       <w:sdtContent>
@@ -77,7 +77,7 @@
           <w:r>
             <w:fldChar w:fldCharType="separate"/>
           </w:r>
-          <w:hyperlink w:anchor="_Toc244114156" w:history="1">
+          <w:hyperlink w:anchor="_Toc244114641" w:history="1">
             <w:r>
               <w:rPr>
                 <w:rStyle w:val="Hyperlink"/>
@@ -101,7 +101,7 @@
               <w:rPr>
                 <w:noProof/>
               </w:rPr>
-              <w:instrText xml:space="preserve"> PAGEREF _Toc244114156 \h </w:instrText>
+              <w:instrText xml:space="preserve"> PAGEREF _Toc244114641 \h </w:instrText>
             </w:r>
             <w:r>
               <w:rPr>
@@ -143,7 +143,7 @@
               <w14:ligatures w14:val="standardContextual"/>
             </w:rPr>
           </w:pPr>
-          <w:hyperlink w:anchor="_Toc244114157" w:history="1">
+          <w:hyperlink w:anchor="_Toc244114642" w:history="1">
             <w:r>
               <w:rPr>
                 <w:rStyle w:val="Hyperlink"/>
@@ -167,7 +167,7 @@
               <w:rPr>
                 <w:noProof/>
               </w:rPr>
-              <w:instrText xml:space="preserve"> PAGEREF _Toc244114157 \h </w:instrText>
+              <w:instrText xml:space="preserve"> PAGEREF _Toc244114642 \h </w:instrText>
             </w:r>
             <w:r>
               <w:rPr>
@@ -209,7 +209,7 @@
               <w14:ligatures w14:val="standardContextual"/>
             </w:rPr>
           </w:pPr>
-          <w:hyperlink w:anchor="_Toc244114158" w:history="1">
+          <w:hyperlink w:anchor="_Toc244114643" w:history="1">
             <w:r>
               <w:rPr>
                 <w:rStyle w:val="Hyperlink"/>
@@ -233,7 +233,7 @@
               <w:rPr>
                 <w:noProof/>
               </w:rPr>
-              <w:instrText xml:space="preserve"> PAGEREF _Toc244114158 \h </w:instrText>
+              <w:instrText xml:space="preserve"> PAGEREF _Toc244114643 \h </w:instrText>
             </w:r>
             <w:r>
               <w:rPr>
@@ -275,7 +275,7 @@
               <w14:ligatures w14:val="standardContextual"/>
             </w:rPr>
           </w:pPr>
-          <w:hyperlink w:anchor="_Toc244114159" w:history="1">
+          <w:hyperlink w:anchor="_Toc244114644" w:history="1">
             <w:r>
               <w:rPr>
                 <w:rStyle w:val="Hyperlink"/>
@@ -299,7 +299,7 @@
               <w:rPr>
                 <w:noProof/>
               </w:rPr>
-              <w:instrText xml:space="preserve"> PAGEREF _Toc244114159 \h </w:instrText>
+              <w:instrText xml:space="preserve"> PAGEREF _Toc244114644 \h </w:instrText>
             </w:r>
             <w:r>
               <w:rPr>
@@ -341,7 +341,7 @@
               <w14:ligatures w14:val="standardContextual"/>
             </w:rPr>
           </w:pPr>
-          <w:hyperlink w:anchor="_Toc244114160" w:history="1">
+          <w:hyperlink w:anchor="_Toc244114645" w:history="1">
             <w:r>
               <w:rPr>
                 <w:rStyle w:val="Hyperlink"/>
@@ -365,7 +365,7 @@
               <w:rPr>
                 <w:noProof/>
               </w:rPr>
-              <w:instrText xml:space="preserve"> PAGEREF _Toc244114160 \h </w:instrText>
+              <w:instrText xml:space="preserve"> PAGEREF _Toc244114645 \h </w:instrText>
             </w:r>
             <w:r>
               <w:rPr>
@@ -407,7 +407,7 @@
               <w14:ligatures w14:val="standardContextual"/>
             </w:rPr>
           </w:pPr>
-          <w:hyperlink w:anchor="_Toc244114161" w:history="1">
+          <w:hyperlink w:anchor="_Toc244114646" w:history="1">
             <w:r>
               <w:rPr>
                 <w:rStyle w:val="Hyperlink"/>
@@ -431,7 +431,7 @@
               <w:rPr>
                 <w:noProof/>
               </w:rPr>
-              <w:instrText xml:space="preserve"> PAGEREF _Toc244114161 \h </w:instrText>
+              <w:instrText xml:space="preserve"> PAGEREF _Toc244114646 \h </w:instrText>
             </w:r>
             <w:r>
               <w:rPr>
@@ -473,7 +473,7 @@
               <w14:ligatures w14:val="standardContextual"/>
             </w:rPr>
           </w:pPr>
-          <w:hyperlink w:anchor="_Toc244114162" w:history="1">
+          <w:hyperlink w:anchor="_Toc244114647" w:history="1">
             <w:r>
               <w:rPr>
                 <w:rStyle w:val="Hyperlink"/>
@@ -497,7 +497,7 @@
               <w:rPr>
                 <w:noProof/>
               </w:rPr>
-              <w:instrText xml:space="preserve"> PAGEREF _Toc244114162 \h </w:instrText>
+              <w:instrText xml:space="preserve"> PAGEREF _Toc244114647 \h </w:instrText>
             </w:r>
             <w:r>
               <w:rPr>
@@ -539,7 +539,7 @@
               <w14:ligatures w14:val="standardContextual"/>
             </w:rPr>
           </w:pPr>
-          <w:hyperlink w:anchor="_Toc244114163" w:history="1">
+          <w:hyperlink w:anchor="_Toc244114648" w:history="1">
             <w:r>
               <w:rPr>
                 <w:rStyle w:val="Hyperlink"/>
@@ -563,7 +563,7 @@
               <w:rPr>
                 <w:noProof/>
               </w:rPr>
-              <w:instrText xml:space="preserve"> PAGEREF _Toc244114163 \h </w:instrText>
+              <w:instrText xml:space="preserve"> PAGEREF _Toc244114648 \h </w:instrText>
             </w:r>
             <w:r>
               <w:rPr>
@@ -580,7 +580,7 @@
               <w:rPr>
                 <w:noProof/>
               </w:rPr>
-              <w:t>3</w:t>
+              <w:t>4</w:t>
             </w:r>
             <w:r>
               <w:rPr>
@@ -605,7 +605,7 @@
               <w14:ligatures w14:val="standardContextual"/>
             </w:rPr>
           </w:pPr>
-          <w:hyperlink w:anchor="_Toc244114164" w:history="1">
+          <w:hyperlink w:anchor="_Toc244114649" w:history="1">
             <w:r>
               <w:rPr>
                 <w:rStyle w:val="Hyperlink"/>
@@ -629,7 +629,7 @@
               <w:rPr>
                 <w:noProof/>
               </w:rPr>
-              <w:instrText xml:space="preserve"> PAGEREF _Toc244114164 \h </w:instrText>
+              <w:instrText xml:space="preserve"> PAGEREF _Toc244114649 \h </w:instrText>
             </w:r>
             <w:r>
               <w:rPr>
@@ -671,7 +671,7 @@
               <w14:ligatures w14:val="standardContextual"/>
             </w:rPr>
           </w:pPr>
-          <w:hyperlink w:anchor="_Toc244114165" w:history="1">
+          <w:hyperlink w:anchor="_Toc244114650" w:history="1">
             <w:r>
               <w:rPr>
                 <w:rStyle w:val="Hyperlink"/>
@@ -695,7 +695,7 @@
               <w:rPr>
                 <w:noProof/>
               </w:rPr>
-              <w:instrText xml:space="preserve"> PAGEREF _Toc244114165 \h </w:instrText>
+              <w:instrText xml:space="preserve"> PAGEREF _Toc244114650 \h </w:instrText>
             </w:r>
             <w:r>
               <w:rPr>
@@ -737,7 +737,7 @@
               <w14:ligatures w14:val="standardContextual"/>
             </w:rPr>
           </w:pPr>
-          <w:hyperlink w:anchor="_Toc244114166" w:history="1">
+          <w:hyperlink w:anchor="_Toc244114651" w:history="1">
             <w:r>
               <w:rPr>
                 <w:rStyle w:val="Hyperlink"/>
@@ -761,7 +761,7 @@
               <w:rPr>
                 <w:noProof/>
               </w:rPr>
-              <w:instrText xml:space="preserve"> PAGEREF _Toc244114166 \h </w:instrText>
+              <w:instrText xml:space="preserve"> PAGEREF _Toc244114651 \h </w:instrText>
             </w:r>
             <w:r>
               <w:rPr>
@@ -778,7 +778,7 @@
               <w:rPr>
                 <w:noProof/>
               </w:rPr>
-              <w:t>4</w:t>
+              <w:t>5</w:t>
             </w:r>
             <w:r>
               <w:rPr>
@@ -803,7 +803,7 @@
               <w14:ligatures w14:val="standardContextual"/>
             </w:rPr>
           </w:pPr>
-          <w:hyperlink w:anchor="_Toc244114167" w:history="1">
+          <w:hyperlink w:anchor="_Toc244114652" w:history="1">
             <w:r>
               <w:rPr>
                 <w:rStyle w:val="Hyperlink"/>
@@ -827,7 +827,7 @@
               <w:rPr>
                 <w:noProof/>
               </w:rPr>
-              <w:instrText xml:space="preserve"> PAGEREF _Toc244114167 \h </w:instrText>
+              <w:instrText xml:space="preserve"> PAGEREF _Toc244114652 \h </w:instrText>
             </w:r>
             <w:r>
               <w:rPr>
@@ -869,7 +869,7 @@
               <w14:ligatures w14:val="standardContextual"/>
             </w:rPr>
           </w:pPr>
-          <w:hyperlink w:anchor="_Toc244114168" w:history="1">
+          <w:hyperlink w:anchor="_Toc244114653" w:history="1">
             <w:r>
               <w:rPr>
                 <w:rStyle w:val="Hyperlink"/>
@@ -893,7 +893,7 @@
               <w:rPr>
                 <w:noProof/>
               </w:rPr>
-              <w:instrText xml:space="preserve"> PAGEREF _Toc244114168 \h </w:instrText>
+              <w:instrText xml:space="preserve"> PAGEREF _Toc244114653 \h </w:instrText>
             </w:r>
             <w:r>
               <w:rPr>
@@ -935,7 +935,7 @@
               <w14:ligatures w14:val="standardContextual"/>
             </w:rPr>
           </w:pPr>
-          <w:hyperlink w:anchor="_Toc244114169" w:history="1">
+          <w:hyperlink w:anchor="_Toc244114654" w:history="1">
             <w:r>
               <w:rPr>
                 <w:rStyle w:val="Hyperlink"/>
@@ -959,7 +959,7 @@
               <w:rPr>
                 <w:noProof/>
               </w:rPr>
-              <w:instrText xml:space="preserve"> PAGEREF _Toc244114169 \h </w:instrText>
+              <w:instrText xml:space="preserve"> PAGEREF _Toc244114654 \h </w:instrText>
             </w:r>
             <w:r>
               <w:rPr>
@@ -976,7 +976,7 @@
               <w:rPr>
                 <w:noProof/>
               </w:rPr>
-              <w:t>7</w:t>
+              <w:t>8</w:t>
             </w:r>
             <w:r>
               <w:rPr>
@@ -1001,7 +1001,7 @@
               <w14:ligatures w14:val="standardContextual"/>
             </w:rPr>
           </w:pPr>
-          <w:hyperlink w:anchor="_Toc244114170" w:history="1">
+          <w:hyperlink w:anchor="_Toc244114655" w:history="1">
             <w:r>
               <w:rPr>
                 <w:rStyle w:val="Hyperlink"/>
@@ -1025,7 +1025,7 @@
               <w:rPr>
                 <w:noProof/>
               </w:rPr>
-              <w:instrText xml:space="preserve"> PAGEREF _Toc244114170 \h </w:instrText>
+              <w:instrText xml:space="preserve"> PAGEREF _Toc244114655 \h </w:instrText>
             </w:r>
             <w:r>
               <w:rPr>
@@ -1067,7 +1067,7 @@
               <w14:ligatures w14:val="standardContextual"/>
             </w:rPr>
           </w:pPr>
-          <w:hyperlink w:anchor="_Toc244114171" w:history="1">
+          <w:hyperlink w:anchor="_Toc244114656" w:history="1">
             <w:r>
               <w:rPr>
                 <w:rStyle w:val="Hyperlink"/>
@@ -1091,7 +1091,7 @@
               <w:rPr>
                 <w:noProof/>
               </w:rPr>
-              <w:instrText xml:space="preserve"> PAGEREF _Toc244114171 \h </w:instrText>
+              <w:instrText xml:space="preserve"> PAGEREF _Toc244114656 \h </w:instrText>
             </w:r>
             <w:r>
               <w:rPr>
@@ -1129,7 +1129,7 @@
       <w:pPr>
         <w:pStyle w:val="Heading1"/>
       </w:pPr>
-      <w:bookmarkStart w:id="0" w:name="_Toc244114156"/>
+      <w:bookmarkStart w:id="0" w:name="_Toc244114641"/>
       <w:r>
         <w:t>1. Objet du document</w:t>
       </w:r>
@@ -1242,7 +1242,7 @@
       <w:pPr>
         <w:pStyle w:val="Heading1"/>
       </w:pPr>
-      <w:bookmarkStart w:id="1" w:name="_Toc244114157"/>
+      <w:bookmarkStart w:id="1" w:name="_Toc244114642"/>
       <w:r>
         <w:t>2. Ce qui est déjà fait (prérequis communs)</w:t>
       </w:r>
@@ -1266,9 +1266,9 @@
         <w:tblLook w:val="04A0" w:firstRow="1" w:lastRow="0" w:firstColumn="1" w:lastColumn="0" w:noHBand="0" w:noVBand="1"/>
       </w:tblPr>
       <w:tblGrid>
-        <w:gridCol w:w="2008"/>
-        <w:gridCol w:w="3857"/>
-        <w:gridCol w:w="3773"/>
+        <w:gridCol w:w="1925"/>
+        <w:gridCol w:w="4066"/>
+        <w:gridCol w:w="3647"/>
       </w:tblGrid>
       <w:tr>
         <w:tblPrEx>
@@ -1767,7 +1767,7 @@
                 <w:sz w:val="19"/>
                 <w:szCs w:val="19"/>
               </w:rPr>
-              <w:t>Découpage gelé</w:t>
+              <w:t>Formulation et preuve de la fuite (L2)</w:t>
             </w:r>
           </w:p>
         </w:tc>
@@ -1798,7 +1798,7 @@
                 <w:sz w:val="19"/>
                 <w:szCs w:val="19"/>
               </w:rPr>
-              <w:t>src/splits.py</w:t>
+              <w:t>src/leakage.py</w:t>
             </w:r>
             <w:r>
               <w:rPr>
@@ -1814,36 +1814,14 @@
                 <w:sz w:val="19"/>
                 <w:szCs w:val="19"/>
               </w:rPr>
-              <w:t>results/splits.csv</w:t>
-            </w:r>
-          </w:p>
-        </w:tc>
-        <w:tc>
-          <w:tcPr>
-            <w:tcW w:w="4144" w:type="dxa"/>
-            <w:tcBorders>
-              <w:top w:val="single" w:sz="4" w:space="0" w:color="BFBFBF"/>
-              <w:left w:val="single" w:sz="4" w:space="0" w:color="BFBFBF"/>
-              <w:bottom w:val="single" w:sz="4" w:space="0" w:color="BFBFBF"/>
-              <w:right w:val="single" w:sz="4" w:space="0" w:color="BFBFBF"/>
-            </w:tcBorders>
-            <w:tcMar>
-              <w:top w:w="60" w:type="dxa"/>
-              <w:left w:w="100" w:type="dxa"/>
-              <w:bottom w:w="60" w:type="dxa"/>
-              <w:right w:w="100" w:type="dxa"/>
-            </w:tcMar>
-          </w:tcPr>
-          <w:p>
-            <w:pPr>
-              <w:spacing w:after="40"/>
-            </w:pPr>
-            <w:r>
-              <w:rPr>
-                <w:sz w:val="19"/>
-                <w:szCs w:val="19"/>
-              </w:rPr>
-              <w:t xml:space="preserve">train 4 233 / val 907 / test 907 scénarios ; </w:t>
+              <w:t>notebooks/L2_problematique.ipynb</w:t>
+            </w:r>
+            <w:r>
+              <w:rPr>
+                <w:sz w:val="19"/>
+                <w:szCs w:val="19"/>
+              </w:rPr>
+              <w:t xml:space="preserve">, </w:t>
             </w:r>
             <w:r>
               <w:rPr>
@@ -1852,14 +1830,36 @@
                 <w:sz w:val="19"/>
                 <w:szCs w:val="19"/>
               </w:rPr>
-              <w:t>test_unseen_topo</w:t>
-            </w:r>
-            <w:r>
-              <w:rPr>
-                <w:sz w:val="19"/>
-                <w:szCs w:val="19"/>
-              </w:rPr>
-              <w:t xml:space="preserve"> = 24 topologies jamais vues (1 080 scénarios).</w:t>
+              <w:t>docs/explications/02_problematique.md</w:t>
+            </w:r>
+          </w:p>
+        </w:tc>
+        <w:tc>
+          <w:tcPr>
+            <w:tcW w:w="4144" w:type="dxa"/>
+            <w:tcBorders>
+              <w:top w:val="single" w:sz="4" w:space="0" w:color="BFBFBF"/>
+              <w:left w:val="single" w:sz="4" w:space="0" w:color="BFBFBF"/>
+              <w:bottom w:val="single" w:sz="4" w:space="0" w:color="BFBFBF"/>
+              <w:right w:val="single" w:sz="4" w:space="0" w:color="BFBFBF"/>
+            </w:tcBorders>
+            <w:tcMar>
+              <w:top w:w="60" w:type="dxa"/>
+              <w:left w:w="100" w:type="dxa"/>
+              <w:bottom w:w="60" w:type="dxa"/>
+              <w:right w:w="100" w:type="dxa"/>
+            </w:tcMar>
+          </w:tcPr>
+          <w:p>
+            <w:pPr>
+              <w:spacing w:after="40"/>
+            </w:pPr>
+            <w:r>
+              <w:rPr>
+                <w:sz w:val="19"/>
+                <w:szCs w:val="19"/>
+              </w:rPr>
+              <w:t>Split aléatoire par flux : erreur annoncée 0,127 contre 0,399 réelle (facteur 3,15) ; split par scénario : 0,358 contre 0,410 (1,14). 3 graines.</w:t>
             </w:r>
           </w:p>
         </w:tc>
@@ -1896,7 +1896,7 @@
                 <w:sz w:val="19"/>
                 <w:szCs w:val="19"/>
               </w:rPr>
-              <w:t>Métriques communes</w:t>
+              <w:t>Découpage gelé</w:t>
             </w:r>
           </w:p>
         </w:tc>
@@ -1927,7 +1927,23 @@
                 <w:sz w:val="19"/>
                 <w:szCs w:val="19"/>
               </w:rPr>
-              <w:t>src/metrics.py</w:t>
+              <w:t>src/splits.py</w:t>
+            </w:r>
+            <w:r>
+              <w:rPr>
+                <w:sz w:val="19"/>
+                <w:szCs w:val="19"/>
+              </w:rPr>
+              <w:t xml:space="preserve">, </w:t>
+            </w:r>
+            <w:r>
+              <w:rPr>
+                <w:rFonts w:ascii="Consolas" w:eastAsia="Consolas" w:hAnsi="Consolas" w:cs="Consolas"/>
+                <w:color w:val="7A2E0E"/>
+                <w:sz w:val="19"/>
+                <w:szCs w:val="19"/>
+              </w:rPr>
+              <w:t>results/splits.csv</w:t>
             </w:r>
           </w:p>
         </w:tc>
@@ -1956,7 +1972,23 @@
                 <w:sz w:val="19"/>
                 <w:szCs w:val="19"/>
               </w:rPr>
-              <w:t>MAE, MSE, RMSE sur log10(délai), MdAPE en %, par type de slice.</w:t>
+              <w:t xml:space="preserve">train 4 233 / val 907 / test 907 scénarios ; </w:t>
+            </w:r>
+            <w:r>
+              <w:rPr>
+                <w:rFonts w:ascii="Consolas" w:eastAsia="Consolas" w:hAnsi="Consolas" w:cs="Consolas"/>
+                <w:color w:val="7A2E0E"/>
+                <w:sz w:val="19"/>
+                <w:szCs w:val="19"/>
+              </w:rPr>
+              <w:t>test_unseen_topo</w:t>
+            </w:r>
+            <w:r>
+              <w:rPr>
+                <w:sz w:val="19"/>
+                <w:szCs w:val="19"/>
+              </w:rPr>
+              <w:t xml:space="preserve"> = 24 topologies jamais vues (1 080 scénarios).</w:t>
             </w:r>
           </w:p>
         </w:tc>
@@ -1993,7 +2025,7 @@
                 <w:sz w:val="19"/>
                 <w:szCs w:val="19"/>
               </w:rPr>
-              <w:t>Formats de fichiers</w:t>
+              <w:t>Métriques communes</w:t>
             </w:r>
           </w:p>
         </w:tc>
@@ -2024,7 +2056,7 @@
                 <w:sz w:val="19"/>
                 <w:szCs w:val="19"/>
               </w:rPr>
-              <w:t>src/contracts.py</w:t>
+              <w:t>src/metrics.py</w:t>
             </w:r>
           </w:p>
         </w:tc>
@@ -2053,7 +2085,7 @@
                 <w:sz w:val="19"/>
                 <w:szCs w:val="19"/>
               </w:rPr>
-              <w:t>Prédictions et masque d'événements (section 4).</w:t>
+              <w:t>MAE, MSE, RMSE sur log10(délai), MdAPE en %, par type de slice.</w:t>
             </w:r>
           </w:p>
         </w:tc>
@@ -2090,7 +2122,7 @@
                 <w:sz w:val="19"/>
                 <w:szCs w:val="19"/>
               </w:rPr>
-              <w:t>Évaluation unique</w:t>
+              <w:t>Formats de fichiers</w:t>
             </w:r>
           </w:p>
         </w:tc>
@@ -2121,7 +2153,7 @@
                 <w:sz w:val="19"/>
                 <w:szCs w:val="19"/>
               </w:rPr>
-              <w:t>src/evaluate.py</w:t>
+              <w:t>src/contracts.py</w:t>
             </w:r>
           </w:p>
         </w:tc>
@@ -2150,23 +2182,7 @@
                 <w:sz w:val="19"/>
                 <w:szCs w:val="19"/>
               </w:rPr>
-              <w:t xml:space="preserve">Lit toutes les prédictions → </w:t>
-            </w:r>
-            <w:r>
-              <w:rPr>
-                <w:rFonts w:ascii="Consolas" w:eastAsia="Consolas" w:hAnsi="Consolas" w:cs="Consolas"/>
-                <w:color w:val="7A2E0E"/>
-                <w:sz w:val="19"/>
-                <w:szCs w:val="19"/>
-              </w:rPr>
-              <w:t>results/metrics_all.csv</w:t>
-            </w:r>
-            <w:r>
-              <w:rPr>
-                <w:sz w:val="19"/>
-                <w:szCs w:val="19"/>
-              </w:rPr>
-              <w:t>.</w:t>
+              <w:t>Prédictions et masque d'événements (section 4).</w:t>
             </w:r>
           </w:p>
         </w:tc>
@@ -2203,7 +2219,7 @@
                 <w:sz w:val="19"/>
                 <w:szCs w:val="19"/>
               </w:rPr>
-              <w:t>Baseline naïve</w:t>
+              <w:t>Évaluation unique</w:t>
             </w:r>
           </w:p>
         </w:tc>
@@ -2234,7 +2250,7 @@
                 <w:sz w:val="19"/>
                 <w:szCs w:val="19"/>
               </w:rPr>
-              <w:t>src/baselines_naive.py</w:t>
+              <w:t>src/evaluate.py</w:t>
             </w:r>
           </w:p>
         </w:tc>
@@ -2263,7 +2279,23 @@
                 <w:sz w:val="19"/>
                 <w:szCs w:val="19"/>
               </w:rPr>
-              <w:t>Médiane train par slice. MAE_log = 0,82 sur test : le plancher à battre.</w:t>
+              <w:t xml:space="preserve">Lit toutes les prédictions → </w:t>
+            </w:r>
+            <w:r>
+              <w:rPr>
+                <w:rFonts w:ascii="Consolas" w:eastAsia="Consolas" w:hAnsi="Consolas" w:cs="Consolas"/>
+                <w:color w:val="7A2E0E"/>
+                <w:sz w:val="19"/>
+                <w:szCs w:val="19"/>
+              </w:rPr>
+              <w:t>results/metrics_all.csv</w:t>
+            </w:r>
+            <w:r>
+              <w:rPr>
+                <w:sz w:val="19"/>
+                <w:szCs w:val="19"/>
+              </w:rPr>
+              <w:t>.</w:t>
             </w:r>
           </w:p>
         </w:tc>
@@ -2300,7 +2332,7 @@
                 <w:sz w:val="19"/>
                 <w:szCs w:val="19"/>
               </w:rPr>
-              <w:t>Données partagées</w:t>
+              <w:t>Baseline naïve</w:t>
             </w:r>
           </w:p>
         </w:tc>
@@ -2324,13 +2356,6 @@
             <w:pPr>
               <w:spacing w:after="40"/>
             </w:pPr>
-            <w:r>
-              <w:rPr>
-                <w:sz w:val="19"/>
-                <w:szCs w:val="19"/>
-              </w:rPr>
-              <w:t xml:space="preserve">release GitHub </w:t>
-            </w:r>
             <w:r>
               <w:rPr>
                 <w:rFonts w:ascii="Consolas" w:eastAsia="Consolas" w:hAnsi="Consolas" w:cs="Consolas"/>
@@ -2338,7 +2363,7 @@
                 <w:sz w:val="19"/>
                 <w:szCs w:val="19"/>
               </w:rPr>
-              <w:t>data-v1</w:t>
+              <w:t>src/baselines_naive.py</w:t>
             </w:r>
           </w:p>
         </w:tc>
@@ -2367,23 +2392,7 @@
                 <w:sz w:val="19"/>
                 <w:szCs w:val="19"/>
               </w:rPr>
-              <w:t xml:space="preserve">8 tables parquet (270 Mo) + SHA-256, via </w:t>
-            </w:r>
-            <w:r>
-              <w:rPr>
-                <w:rFonts w:ascii="Consolas" w:eastAsia="Consolas" w:hAnsi="Consolas" w:cs="Consolas"/>
-                <w:color w:val="7A2E0E"/>
-                <w:sz w:val="19"/>
-                <w:szCs w:val="19"/>
-              </w:rPr>
-              <w:t>src/data_sync.py</w:t>
-            </w:r>
-            <w:r>
-              <w:rPr>
-                <w:sz w:val="19"/>
-                <w:szCs w:val="19"/>
-              </w:rPr>
-              <w:t>.</w:t>
+              <w:t>Médiane train par slice. MAE_log = 0,82 sur test : le plancher à battre.</w:t>
             </w:r>
           </w:p>
         </w:tc>
@@ -2420,6 +2429,133 @@
                 <w:sz w:val="19"/>
                 <w:szCs w:val="19"/>
               </w:rPr>
+              <w:t>Données partagées</w:t>
+            </w:r>
+          </w:p>
+        </w:tc>
+        <w:tc>
+          <w:tcPr>
+            <w:tcW w:w="3181" w:type="dxa"/>
+            <w:tcBorders>
+              <w:top w:val="single" w:sz="4" w:space="0" w:color="BFBFBF"/>
+              <w:left w:val="single" w:sz="4" w:space="0" w:color="BFBFBF"/>
+              <w:bottom w:val="single" w:sz="4" w:space="0" w:color="BFBFBF"/>
+              <w:right w:val="single" w:sz="4" w:space="0" w:color="BFBFBF"/>
+            </w:tcBorders>
+            <w:tcMar>
+              <w:top w:w="60" w:type="dxa"/>
+              <w:left w:w="100" w:type="dxa"/>
+              <w:bottom w:w="60" w:type="dxa"/>
+              <w:right w:w="100" w:type="dxa"/>
+            </w:tcMar>
+          </w:tcPr>
+          <w:p>
+            <w:pPr>
+              <w:spacing w:after="40"/>
+            </w:pPr>
+            <w:r>
+              <w:rPr>
+                <w:sz w:val="19"/>
+                <w:szCs w:val="19"/>
+              </w:rPr>
+              <w:t xml:space="preserve">release GitHub </w:t>
+            </w:r>
+            <w:r>
+              <w:rPr>
+                <w:rFonts w:ascii="Consolas" w:eastAsia="Consolas" w:hAnsi="Consolas" w:cs="Consolas"/>
+                <w:color w:val="7A2E0E"/>
+                <w:sz w:val="19"/>
+                <w:szCs w:val="19"/>
+              </w:rPr>
+              <w:t>data-v1</w:t>
+            </w:r>
+            <w:r>
+              <w:rPr>
+                <w:sz w:val="19"/>
+                <w:szCs w:val="19"/>
+              </w:rPr>
+              <w:t xml:space="preserve"> (publique)</w:t>
+            </w:r>
+          </w:p>
+        </w:tc>
+        <w:tc>
+          <w:tcPr>
+            <w:tcW w:w="4144" w:type="dxa"/>
+            <w:tcBorders>
+              <w:top w:val="single" w:sz="4" w:space="0" w:color="BFBFBF"/>
+              <w:left w:val="single" w:sz="4" w:space="0" w:color="BFBFBF"/>
+              <w:bottom w:val="single" w:sz="4" w:space="0" w:color="BFBFBF"/>
+              <w:right w:val="single" w:sz="4" w:space="0" w:color="BFBFBF"/>
+            </w:tcBorders>
+            <w:tcMar>
+              <w:top w:w="60" w:type="dxa"/>
+              <w:left w:w="100" w:type="dxa"/>
+              <w:bottom w:w="60" w:type="dxa"/>
+              <w:right w:w="100" w:type="dxa"/>
+            </w:tcMar>
+          </w:tcPr>
+          <w:p>
+            <w:pPr>
+              <w:spacing w:after="40"/>
+            </w:pPr>
+            <w:r>
+              <w:rPr>
+                <w:sz w:val="19"/>
+                <w:szCs w:val="19"/>
+              </w:rPr>
+              <w:t xml:space="preserve">8 tables parquet (270 Mo) + SHA-256, via </w:t>
+            </w:r>
+            <w:r>
+              <w:rPr>
+                <w:rFonts w:ascii="Consolas" w:eastAsia="Consolas" w:hAnsi="Consolas" w:cs="Consolas"/>
+                <w:color w:val="7A2E0E"/>
+                <w:sz w:val="19"/>
+                <w:szCs w:val="19"/>
+              </w:rPr>
+              <w:t>src/data_sync.py fetch</w:t>
+            </w:r>
+            <w:r>
+              <w:rPr>
+                <w:sz w:val="19"/>
+                <w:szCs w:val="19"/>
+              </w:rPr>
+              <w:t xml:space="preserve"> (HTTPS, sans compte). Licence des données : CC BY 4.0 (citer Farreras et al., 2024).</w:t>
+            </w:r>
+          </w:p>
+        </w:tc>
+      </w:tr>
+      <w:tr>
+        <w:tblPrEx>
+          <w:tblCellMar>
+            <w:top w:w="0" w:type="dxa"/>
+            <w:bottom w:w="0" w:type="dxa"/>
+          </w:tblCellMar>
+        </w:tblPrEx>
+        <w:tc>
+          <w:tcPr>
+            <w:tcW w:w="2313" w:type="dxa"/>
+            <w:tcBorders>
+              <w:top w:val="single" w:sz="4" w:space="0" w:color="BFBFBF"/>
+              <w:left w:val="single" w:sz="4" w:space="0" w:color="BFBFBF"/>
+              <w:bottom w:val="single" w:sz="4" w:space="0" w:color="BFBFBF"/>
+              <w:right w:val="single" w:sz="4" w:space="0" w:color="BFBFBF"/>
+            </w:tcBorders>
+            <w:tcMar>
+              <w:top w:w="60" w:type="dxa"/>
+              <w:left w:w="100" w:type="dxa"/>
+              <w:bottom w:w="60" w:type="dxa"/>
+              <w:right w:w="100" w:type="dxa"/>
+            </w:tcMar>
+          </w:tcPr>
+          <w:p>
+            <w:pPr>
+              <w:spacing w:after="40"/>
+            </w:pPr>
+            <w:r>
+              <w:rPr>
+                <w:sz w:val="19"/>
+                <w:szCs w:val="19"/>
+              </w:rPr>
               <w:t>GPU</w:t>
             </w:r>
           </w:p>
@@ -2513,7 +2649,7 @@
       <w:pPr>
         <w:pStyle w:val="Heading1"/>
       </w:pPr>
-      <w:bookmarkStart w:id="2" w:name="_Toc244114158"/>
+      <w:bookmarkStart w:id="2" w:name="_Toc244114643"/>
       <w:r>
         <w:t>3. Démarrage (à faire une fois, ~20 minutes)</w:t>
       </w:r>
@@ -2524,19 +2660,27 @@
         <w:spacing w:after="120" w:line="276" w:lineRule="auto"/>
       </w:pPr>
       <w:r>
-        <w:t>Prérequis : Python 3.13, Git, GitHub CLI (</w:t>
-      </w:r>
-      <w:r>
-        <w:rPr>
-          <w:rFonts w:ascii="Consolas" w:eastAsia="Consolas" w:hAnsi="Consolas" w:cs="Consolas"/>
-          <w:color w:val="7A2E0E"/>
-          <w:sz w:val="19"/>
-          <w:szCs w:val="19"/>
-        </w:rPr>
-        <w:t>gh</w:t>
-      </w:r>
-      <w:r>
-        <w:t>), et une invitation au dépôt privé (Souhail l'envoie à partir de vos identifiants GitHub).</w:t>
+        <w:t xml:space="preserve">Prérequis : Python 3.13 et Git. Le dépôt est </w:t>
+      </w:r>
+      <w:r>
+        <w:rPr>
+          <w:b/>
+          <w:bCs/>
+        </w:rPr>
+        <w:t>public</w:t>
+      </w:r>
+      <w:r>
+        <w:t xml:space="preserve"> : lire, cloner et télécharger les données ne demande aucun compte. Pour </w:t>
+      </w:r>
+      <w:r>
+        <w:rPr>
+          <w:b/>
+          <w:bCs/>
+        </w:rPr>
+        <w:t>pousser</w:t>
+      </w:r>
+      <w:r>
+        <w:t xml:space="preserve"> du code, Souhail ajoute chaque coéquipier comme collaborateur (un compte GitHub est alors nécessaire).</w:t>
       </w:r>
     </w:p>
     <w:p>
@@ -2667,6 +2811,7 @@
     <w:p>
       <w:pPr>
         <w:shd w:val="clear" w:color="auto" w:fill="F2F2F2"/>
+        <w:spacing w:after="140"/>
         <w:ind w:left="200"/>
       </w:pPr>
       <w:r>
@@ -2675,22 +2820,7 @@
           <w:sz w:val="18"/>
           <w:szCs w:val="18"/>
         </w:rPr>
-        <w:t>gh auth login</w:t>
-      </w:r>
-    </w:p>
-    <w:p>
-      <w:pPr>
-        <w:shd w:val="clear" w:color="auto" w:fill="F2F2F2"/>
-        <w:spacing w:after="140"/>
-        <w:ind w:left="200"/>
-      </w:pPr>
-      <w:r>
-        <w:rPr>
-          <w:rFonts w:ascii="Consolas" w:eastAsia="Consolas" w:hAnsi="Consolas" w:cs="Consolas"/>
-          <w:sz w:val="18"/>
-          <w:szCs w:val="18"/>
-        </w:rPr>
-        <w:t>python -m src.data_sync fetch      # télécharge et vérifie les SHA-256</w:t>
+        <w:t>python -m src.data_sync fetch      # télécharge (HTTPS) et vérifie les SHA-256</w:t>
       </w:r>
     </w:p>
     <w:p>
@@ -2764,7 +2894,7 @@
       <w:pPr>
         <w:pStyle w:val="Heading1"/>
       </w:pPr>
-      <w:bookmarkStart w:id="3" w:name="_Toc244114159"/>
+      <w:bookmarkStart w:id="3" w:name="_Toc244114644"/>
       <w:r>
         <w:t>4. Règles communes</w:t>
       </w:r>
@@ -2774,7 +2904,7 @@
       <w:pPr>
         <w:pStyle w:val="Heading2"/>
       </w:pPr>
-      <w:bookmarkStart w:id="4" w:name="_Toc244114160"/>
+      <w:bookmarkStart w:id="4" w:name="_Toc244114645"/>
       <w:r>
         <w:t>4.1 Travailler sans se marcher dessus</w:t>
       </w:r>
@@ -2922,7 +3052,29 @@
         <w:spacing w:after="60"/>
       </w:pPr>
       <w:r>
-        <w:t xml:space="preserve">Ne jamais modifier </w:t>
+        <w:t xml:space="preserve">Le dépôt est </w:t>
+      </w:r>
+      <w:r>
+        <w:rPr>
+          <w:b/>
+          <w:bCs/>
+        </w:rPr>
+        <w:t>public</w:t>
+      </w:r>
+      <w:r>
+        <w:t xml:space="preserve"> : ne jamais committer de mot de passe, de jeton ou de clé, ni de fichiers volumineux (données brutes 6,6 Go, checkpoints). </w:t>
+      </w:r>
+      <w:r>
+        <w:rPr>
+          <w:rFonts w:ascii="Consolas" w:eastAsia="Consolas" w:hAnsi="Consolas" w:cs="Consolas"/>
+          <w:color w:val="7A2E0E"/>
+          <w:sz w:val="19"/>
+          <w:szCs w:val="19"/>
+        </w:rPr>
+        <w:t>data/raw/</w:t>
+      </w:r>
+      <w:r>
+        <w:t xml:space="preserve">, </w:t>
       </w:r>
       <w:r>
         <w:rPr>
@@ -2934,19 +3086,43 @@
         <w:t>data/processed/</w:t>
       </w:r>
       <w:r>
-        <w:t xml:space="preserve"> à la main. Si une table doit changer, Souhail publie </w:t>
-      </w:r>
-      <w:r>
-        <w:rPr>
-          <w:rFonts w:ascii="Consolas" w:eastAsia="Consolas" w:hAnsi="Consolas" w:cs="Consolas"/>
-          <w:color w:val="7A2E0E"/>
-          <w:sz w:val="19"/>
-          <w:szCs w:val="19"/>
-        </w:rPr>
-        <w:t>data-v2</w:t>
-      </w:r>
-      <w:r>
-        <w:t xml:space="preserve"> et prévient tout le monde.</w:t>
+        <w:t xml:space="preserve">, </w:t>
+      </w:r>
+      <w:r>
+        <w:rPr>
+          <w:rFonts w:ascii="Consolas" w:eastAsia="Consolas" w:hAnsi="Consolas" w:cs="Consolas"/>
+          <w:color w:val="7A2E0E"/>
+          <w:sz w:val="19"/>
+          <w:szCs w:val="19"/>
+        </w:rPr>
+        <w:t>checkpoints/</w:t>
+      </w:r>
+      <w:r>
+        <w:t xml:space="preserve"> et </w:t>
+      </w:r>
+      <w:r>
+        <w:rPr>
+          <w:rFonts w:ascii="Consolas" w:eastAsia="Consolas" w:hAnsi="Consolas" w:cs="Consolas"/>
+          <w:color w:val="7A2E0E"/>
+          <w:sz w:val="19"/>
+          <w:szCs w:val="19"/>
+        </w:rPr>
+        <w:t>logs/</w:t>
+      </w:r>
+      <w:r>
+        <w:t xml:space="preserve"> sont déjà dans </w:t>
+      </w:r>
+      <w:r>
+        <w:rPr>
+          <w:rFonts w:ascii="Consolas" w:eastAsia="Consolas" w:hAnsi="Consolas" w:cs="Consolas"/>
+          <w:color w:val="7A2E0E"/>
+          <w:sz w:val="19"/>
+          <w:szCs w:val="19"/>
+        </w:rPr>
+        <w:t>.gitignore</w:t>
+      </w:r>
+      <w:r>
+        <w:t>.</w:t>
       </w:r>
     </w:p>
     <w:p>
@@ -2959,54 +3135,32 @@
         <w:spacing w:after="60"/>
       </w:pPr>
       <w:r>
-        <w:t>Graines fixes partout (</w:t>
-      </w:r>
-      <w:r>
-        <w:rPr>
-          <w:rFonts w:ascii="Consolas" w:eastAsia="Consolas" w:hAnsi="Consolas" w:cs="Consolas"/>
-          <w:color w:val="7A2E0E"/>
-          <w:sz w:val="19"/>
-          <w:szCs w:val="19"/>
-        </w:rPr>
-        <w:t>SEED = 42</w:t>
-      </w:r>
-      <w:r>
-        <w:t xml:space="preserve"> dans </w:t>
-      </w:r>
-      <w:r>
-        <w:rPr>
-          <w:rFonts w:ascii="Consolas" w:eastAsia="Consolas" w:hAnsi="Consolas" w:cs="Consolas"/>
-          <w:color w:val="7A2E0E"/>
-          <w:sz w:val="19"/>
-          <w:szCs w:val="19"/>
-        </w:rPr>
-        <w:t>src/config.py</w:t>
-      </w:r>
-      <w:r>
-        <w:t xml:space="preserve">, et </w:t>
-      </w:r>
-      <w:r>
-        <w:rPr>
-          <w:rFonts w:ascii="Consolas" w:eastAsia="Consolas" w:hAnsi="Consolas" w:cs="Consolas"/>
-          <w:color w:val="7A2E0E"/>
-          <w:sz w:val="19"/>
-          <w:szCs w:val="19"/>
-        </w:rPr>
-        <w:t>--seed k</w:t>
-      </w:r>
-      <w:r>
-        <w:t xml:space="preserve"> pour les répétitions).</w:t>
-      </w:r>
-    </w:p>
-    <w:p>
-      <w:pPr>
-        <w:pStyle w:val="Heading2"/>
-      </w:pPr>
-      <w:bookmarkStart w:id="5" w:name="_Toc244114161"/>
-      <w:r>
-        <w:t>4.2 Rigueur expérimentale (non négociable)</w:t>
-      </w:r>
-      <w:bookmarkEnd w:id="5"/>
+        <w:t xml:space="preserve">Ne jamais modifier </w:t>
+      </w:r>
+      <w:r>
+        <w:rPr>
+          <w:rFonts w:ascii="Consolas" w:eastAsia="Consolas" w:hAnsi="Consolas" w:cs="Consolas"/>
+          <w:color w:val="7A2E0E"/>
+          <w:sz w:val="19"/>
+          <w:szCs w:val="19"/>
+        </w:rPr>
+        <w:t>data/processed/</w:t>
+      </w:r>
+      <w:r>
+        <w:t xml:space="preserve"> à la main. Si une table doit changer, Souhail publie </w:t>
+      </w:r>
+      <w:r>
+        <w:rPr>
+          <w:rFonts w:ascii="Consolas" w:eastAsia="Consolas" w:hAnsi="Consolas" w:cs="Consolas"/>
+          <w:color w:val="7A2E0E"/>
+          <w:sz w:val="19"/>
+          <w:szCs w:val="19"/>
+        </w:rPr>
+        <w:t>data-v2</w:t>
+      </w:r>
+      <w:r>
+        <w:t xml:space="preserve"> et prévient tout le monde.</w:t>
+      </w:r>
     </w:p>
     <w:p>
       <w:pPr>
@@ -3018,30 +3172,54 @@
         <w:spacing w:after="60"/>
       </w:pPr>
       <w:r>
-        <w:t xml:space="preserve">Utiliser </w:t>
-      </w:r>
-      <w:r>
-        <w:rPr>
-          <w:b/>
-          <w:bCs/>
-        </w:rPr>
-        <w:t>uniquement</w:t>
-      </w:r>
-      <w:r>
-        <w:t xml:space="preserve"> </w:t>
-      </w:r>
-      <w:r>
-        <w:rPr>
-          <w:rFonts w:ascii="Consolas" w:eastAsia="Consolas" w:hAnsi="Consolas" w:cs="Consolas"/>
-          <w:color w:val="7A2E0E"/>
-          <w:sz w:val="19"/>
-          <w:szCs w:val="19"/>
-        </w:rPr>
-        <w:t>load_splits()</w:t>
-      </w:r>
-      <w:r>
-        <w:t>. Jamais de découpage maison, jamais de split aléatoire par flux (sauf l'expérience de fuite du volet C).</w:t>
-      </w:r>
+        <w:t>Graines fixes partout (</w:t>
+      </w:r>
+      <w:r>
+        <w:rPr>
+          <w:rFonts w:ascii="Consolas" w:eastAsia="Consolas" w:hAnsi="Consolas" w:cs="Consolas"/>
+          <w:color w:val="7A2E0E"/>
+          <w:sz w:val="19"/>
+          <w:szCs w:val="19"/>
+        </w:rPr>
+        <w:t>SEED = 42</w:t>
+      </w:r>
+      <w:r>
+        <w:t xml:space="preserve"> dans </w:t>
+      </w:r>
+      <w:r>
+        <w:rPr>
+          <w:rFonts w:ascii="Consolas" w:eastAsia="Consolas" w:hAnsi="Consolas" w:cs="Consolas"/>
+          <w:color w:val="7A2E0E"/>
+          <w:sz w:val="19"/>
+          <w:szCs w:val="19"/>
+        </w:rPr>
+        <w:t>src/config.py</w:t>
+      </w:r>
+      <w:r>
+        <w:t xml:space="preserve">, et </w:t>
+      </w:r>
+      <w:r>
+        <w:rPr>
+          <w:rFonts w:ascii="Consolas" w:eastAsia="Consolas" w:hAnsi="Consolas" w:cs="Consolas"/>
+          <w:color w:val="7A2E0E"/>
+          <w:sz w:val="19"/>
+          <w:szCs w:val="19"/>
+        </w:rPr>
+        <w:t>--seed k</w:t>
+      </w:r>
+      <w:r>
+        <w:t xml:space="preserve"> pour les répétitions).</w:t>
+      </w:r>
+    </w:p>
+    <w:p>
+      <w:pPr>
+        <w:pStyle w:val="Heading2"/>
+      </w:pPr>
+      <w:bookmarkStart w:id="5" w:name="_Toc244114646"/>
+      <w:r>
+        <w:t>4.2 Rigueur expérimentale (non négociable)</w:t>
+      </w:r>
+      <w:bookmarkEnd w:id="5"/>
     </w:p>
     <w:p>
       <w:pPr>
@@ -3053,37 +3231,29 @@
         <w:spacing w:after="60"/>
       </w:pPr>
       <w:r>
-        <w:t xml:space="preserve">Tout ce qui est appris (scaler, encodeur, seuil, hyperparamètre, τ) est ajusté sur </w:t>
+        <w:t xml:space="preserve">Utiliser </w:t>
       </w:r>
       <w:r>
         <w:rPr>
           <w:b/>
           <w:bCs/>
         </w:rPr>
-        <w:t>train</w:t>
-      </w:r>
-      <w:r>
-        <w:t xml:space="preserve">, choisi sur </w:t>
-      </w:r>
-      <w:r>
-        <w:rPr>
-          <w:b/>
-          <w:bCs/>
-        </w:rPr>
-        <w:t>val</w:t>
-      </w:r>
-      <w:r>
-        <w:t xml:space="preserve">. Le </w:t>
-      </w:r>
-      <w:r>
-        <w:rPr>
-          <w:b/>
-          <w:bCs/>
-        </w:rPr>
-        <w:t>test</w:t>
-      </w:r>
-      <w:r>
-        <w:t xml:space="preserve"> n'est regardé qu'une fois, à la fin, avec la configuration finale.</w:t>
+        <w:t>uniquement</w:t>
+      </w:r>
+      <w:r>
+        <w:t xml:space="preserve"> </w:t>
+      </w:r>
+      <w:r>
+        <w:rPr>
+          <w:rFonts w:ascii="Consolas" w:eastAsia="Consolas" w:hAnsi="Consolas" w:cs="Consolas"/>
+          <w:color w:val="7A2E0E"/>
+          <w:sz w:val="19"/>
+          <w:szCs w:val="19"/>
+        </w:rPr>
+        <w:t>load_splits()</w:t>
+      </w:r>
+      <w:r>
+        <w:t>. Jamais de découpage maison, jamais de split aléatoire par flux (sauf l'expérience de fuite du volet C).</w:t>
       </w:r>
     </w:p>
     <w:p>
@@ -3096,91 +3266,37 @@
         <w:spacing w:after="60"/>
       </w:pPr>
       <w:r>
-        <w:t xml:space="preserve">Aucune feature ne doit venir d'une sortie de simulation : </w:t>
-      </w:r>
-      <w:r>
-        <w:rPr>
-          <w:rFonts w:ascii="Consolas" w:eastAsia="Consolas" w:hAnsi="Consolas" w:cs="Consolas"/>
-          <w:color w:val="7A2E0E"/>
-          <w:sz w:val="19"/>
-          <w:szCs w:val="19"/>
-        </w:rPr>
-        <w:t>meas_*</w:t>
-      </w:r>
-      <w:r>
-        <w:t xml:space="preserve">, </w:t>
-      </w:r>
-      <w:r>
-        <w:rPr>
-          <w:rFonts w:ascii="Consolas" w:eastAsia="Consolas" w:hAnsi="Consolas" w:cs="Consolas"/>
-          <w:color w:val="7A2E0E"/>
-          <w:sz w:val="19"/>
-          <w:szCs w:val="19"/>
-        </w:rPr>
-        <w:t>p10…p90</w:t>
-      </w:r>
-      <w:r>
-        <w:t xml:space="preserve">, </w:t>
-      </w:r>
-      <w:r>
-        <w:rPr>
-          <w:rFonts w:ascii="Consolas" w:eastAsia="Consolas" w:hAnsi="Consolas" w:cs="Consolas"/>
-          <w:color w:val="7A2E0E"/>
-          <w:sz w:val="19"/>
-          <w:szCs w:val="19"/>
-        </w:rPr>
-        <w:t>ln_delay</w:t>
-      </w:r>
-      <w:r>
-        <w:t xml:space="preserve">, </w:t>
-      </w:r>
-      <w:r>
-        <w:rPr>
-          <w:rFonts w:ascii="Consolas" w:eastAsia="Consolas" w:hAnsi="Consolas" w:cs="Consolas"/>
-          <w:color w:val="7A2E0E"/>
-          <w:sz w:val="19"/>
-          <w:szCs w:val="19"/>
-        </w:rPr>
-        <w:t>jitter</w:t>
-      </w:r>
-      <w:r>
-        <w:t xml:space="preserve">, </w:t>
-      </w:r>
-      <w:r>
-        <w:rPr>
-          <w:rFonts w:ascii="Consolas" w:eastAsia="Consolas" w:hAnsi="Consolas" w:cs="Consolas"/>
-          <w:color w:val="7A2E0E"/>
-          <w:sz w:val="19"/>
-          <w:szCs w:val="19"/>
-        </w:rPr>
-        <w:t>pkts_drop</w:t>
-      </w:r>
-      <w:r>
-        <w:t xml:space="preserve">, </w:t>
-      </w:r>
-      <w:r>
-        <w:rPr>
-          <w:rFonts w:ascii="Consolas" w:eastAsia="Consolas" w:hAnsi="Consolas" w:cs="Consolas"/>
-          <w:color w:val="7A2E0E"/>
-          <w:sz w:val="19"/>
-          <w:szCs w:val="19"/>
-        </w:rPr>
-        <w:t>global_*</w:t>
-      </w:r>
-      <w:r>
-        <w:t xml:space="preserve">. Voir </w:t>
-      </w:r>
-      <w:r>
-        <w:rPr>
-          <w:rFonts w:ascii="Consolas" w:eastAsia="Consolas" w:hAnsi="Consolas" w:cs="Consolas"/>
-          <w:color w:val="7A2E0E"/>
-          <w:sz w:val="19"/>
-          <w:szCs w:val="19"/>
-        </w:rPr>
-        <w:t>results/variables.csv</w:t>
-      </w:r>
-      <w:r>
-        <w:t>, colonne « rôle potentiel ».</w:t>
+        <w:t xml:space="preserve">Tout ce qui est appris (scaler, encodeur, seuil, hyperparamètre, τ) est ajusté sur </w:t>
+      </w:r>
+      <w:r>
+        <w:rPr>
+          <w:b/>
+          <w:bCs/>
+        </w:rPr>
+        <w:t>train</w:t>
+      </w:r>
+      <w:r>
+        <w:t xml:space="preserve">, choisi sur </w:t>
+      </w:r>
+      <w:r>
+        <w:rPr>
+          <w:b/>
+          <w:bCs/>
+        </w:rPr>
+        <w:t>val</w:t>
+      </w:r>
+      <w:r>
+        <w:t xml:space="preserve">. Le </w:t>
+      </w:r>
+      <w:r>
+        <w:rPr>
+          <w:b/>
+          <w:bCs/>
+        </w:rPr>
+        <w:t>test</w:t>
+      </w:r>
+      <w:r>
+        <w:t xml:space="preserve"> n'est regardé qu'une fois, à la fin, avec la configuration finale.</w:t>
       </w:r>
     </w:p>
     <w:p>
@@ -3193,19 +3309,91 @@
         <w:spacing w:after="60"/>
       </w:pPr>
       <w:r>
-        <w:t>Les flux sans délai défini (</w:t>
-      </w:r>
-      <w:r>
-        <w:rPr>
-          <w:rFonts w:ascii="Consolas" w:eastAsia="Consolas" w:hAnsi="Consolas" w:cs="Consolas"/>
-          <w:color w:val="7A2E0E"/>
-          <w:sz w:val="19"/>
-          <w:szCs w:val="19"/>
-        </w:rPr>
-        <w:t>has_delay == False</w:t>
-      </w:r>
-      <w:r>
-        <w:t>, 9 flux) sont exclus de la régression du délai.</w:t>
+        <w:t xml:space="preserve">Aucune feature ne doit venir d'une sortie de simulation : </w:t>
+      </w:r>
+      <w:r>
+        <w:rPr>
+          <w:rFonts w:ascii="Consolas" w:eastAsia="Consolas" w:hAnsi="Consolas" w:cs="Consolas"/>
+          <w:color w:val="7A2E0E"/>
+          <w:sz w:val="19"/>
+          <w:szCs w:val="19"/>
+        </w:rPr>
+        <w:t>meas_*</w:t>
+      </w:r>
+      <w:r>
+        <w:t xml:space="preserve">, </w:t>
+      </w:r>
+      <w:r>
+        <w:rPr>
+          <w:rFonts w:ascii="Consolas" w:eastAsia="Consolas" w:hAnsi="Consolas" w:cs="Consolas"/>
+          <w:color w:val="7A2E0E"/>
+          <w:sz w:val="19"/>
+          <w:szCs w:val="19"/>
+        </w:rPr>
+        <w:t>p10…p90</w:t>
+      </w:r>
+      <w:r>
+        <w:t xml:space="preserve">, </w:t>
+      </w:r>
+      <w:r>
+        <w:rPr>
+          <w:rFonts w:ascii="Consolas" w:eastAsia="Consolas" w:hAnsi="Consolas" w:cs="Consolas"/>
+          <w:color w:val="7A2E0E"/>
+          <w:sz w:val="19"/>
+          <w:szCs w:val="19"/>
+        </w:rPr>
+        <w:t>ln_delay</w:t>
+      </w:r>
+      <w:r>
+        <w:t xml:space="preserve">, </w:t>
+      </w:r>
+      <w:r>
+        <w:rPr>
+          <w:rFonts w:ascii="Consolas" w:eastAsia="Consolas" w:hAnsi="Consolas" w:cs="Consolas"/>
+          <w:color w:val="7A2E0E"/>
+          <w:sz w:val="19"/>
+          <w:szCs w:val="19"/>
+        </w:rPr>
+        <w:t>jitter</w:t>
+      </w:r>
+      <w:r>
+        <w:t xml:space="preserve">, </w:t>
+      </w:r>
+      <w:r>
+        <w:rPr>
+          <w:rFonts w:ascii="Consolas" w:eastAsia="Consolas" w:hAnsi="Consolas" w:cs="Consolas"/>
+          <w:color w:val="7A2E0E"/>
+          <w:sz w:val="19"/>
+          <w:szCs w:val="19"/>
+        </w:rPr>
+        <w:t>pkts_drop</w:t>
+      </w:r>
+      <w:r>
+        <w:t xml:space="preserve">, </w:t>
+      </w:r>
+      <w:r>
+        <w:rPr>
+          <w:rFonts w:ascii="Consolas" w:eastAsia="Consolas" w:hAnsi="Consolas" w:cs="Consolas"/>
+          <w:color w:val="7A2E0E"/>
+          <w:sz w:val="19"/>
+          <w:szCs w:val="19"/>
+        </w:rPr>
+        <w:t>global_*</w:t>
+      </w:r>
+      <w:r>
+        <w:t xml:space="preserve">. Voir </w:t>
+      </w:r>
+      <w:r>
+        <w:rPr>
+          <w:rFonts w:ascii="Consolas" w:eastAsia="Consolas" w:hAnsi="Consolas" w:cs="Consolas"/>
+          <w:color w:val="7A2E0E"/>
+          <w:sz w:val="19"/>
+          <w:szCs w:val="19"/>
+        </w:rPr>
+        <w:t>results/variables.csv</w:t>
+      </w:r>
+      <w:r>
+        <w:t>, colonne « rôle potentiel ».</w:t>
       </w:r>
     </w:p>
     <w:p>
@@ -3218,6 +3406,31 @@
         <w:spacing w:after="60"/>
       </w:pPr>
       <w:r>
+        <w:t>Les flux sans délai défini (</w:t>
+      </w:r>
+      <w:r>
+        <w:rPr>
+          <w:rFonts w:ascii="Consolas" w:eastAsia="Consolas" w:hAnsi="Consolas" w:cs="Consolas"/>
+          <w:color w:val="7A2E0E"/>
+          <w:sz w:val="19"/>
+          <w:szCs w:val="19"/>
+        </w:rPr>
+        <w:t>has_delay == False</w:t>
+      </w:r>
+      <w:r>
+        <w:t>, 9 flux) sont exclus de la régression du délai.</w:t>
+      </w:r>
+    </w:p>
+    <w:p>
+      <w:pPr>
+        <w:pStyle w:val="ListParagraph"/>
+        <w:numPr>
+          <w:ilvl w:val="0"/>
+          <w:numId w:val="3"/>
+        </w:numPr>
+        <w:spacing w:after="60"/>
+      </w:pPr>
+      <w:r>
         <w:t xml:space="preserve">Tout chiffre cité dans un rapport ou une explication sort d'un fichier de </w:t>
       </w:r>
       <w:r>
@@ -3237,7 +3450,7 @@
       <w:pPr>
         <w:pStyle w:val="Heading2"/>
       </w:pPr>
-      <w:bookmarkStart w:id="6" w:name="_Toc244114162"/>
+      <w:bookmarkStart w:id="6" w:name="_Toc244114647"/>
       <w:r>
         <w:t>4.3 Contrats de fichiers</w:t>
       </w:r>
@@ -4085,7 +4298,7 @@
       <w:pPr>
         <w:pStyle w:val="Heading2"/>
       </w:pPr>
-      <w:bookmarkStart w:id="7" w:name="_Toc244114163"/>
+      <w:bookmarkStart w:id="7" w:name="_Toc244114648"/>
       <w:r>
         <w:t>4.4 Qui possède quels fichiers</w:t>
       </w:r>
@@ -4580,7 +4793,7 @@
                 <w:sz w:val="19"/>
                 <w:szCs w:val="19"/>
               </w:rPr>
-              <w:t>src/leakage.py</w:t>
+              <w:t>src/baselines_ml.py</w:t>
             </w:r>
             <w:r>
               <w:rPr>
@@ -4596,7 +4809,7 @@
                 <w:sz w:val="19"/>
                 <w:szCs w:val="19"/>
               </w:rPr>
-              <w:t>src/baselines_ml.py</w:t>
+              <w:t>src/bootstrap.py</w:t>
             </w:r>
             <w:r>
               <w:rPr>
@@ -4612,7 +4825,7 @@
                 <w:sz w:val="19"/>
                 <w:szCs w:val="19"/>
               </w:rPr>
-              <w:t>src/bootstrap.py</w:t>
+              <w:t>notebooks/L3_baselines.py</w:t>
             </w:r>
             <w:r>
               <w:rPr>
@@ -4628,14 +4841,14 @@
                 <w:sz w:val="19"/>
                 <w:szCs w:val="19"/>
               </w:rPr>
-              <w:t>notebooks/L2_problematique.py</w:t>
-            </w:r>
-            <w:r>
-              <w:rPr>
-                <w:sz w:val="19"/>
-                <w:szCs w:val="19"/>
-              </w:rPr>
-              <w:t xml:space="preserve">, </w:t>
+              <w:t>docs/explications/03_baselines.md</w:t>
+            </w:r>
+            <w:r>
+              <w:rPr>
+                <w:sz w:val="19"/>
+                <w:szCs w:val="19"/>
+              </w:rPr>
+              <w:t xml:space="preserve"> ; reprend aussi L2 (déjà écrit : </w:t>
             </w:r>
             <w:r>
               <w:rPr>
@@ -4644,7 +4857,7 @@
                 <w:sz w:val="19"/>
                 <w:szCs w:val="19"/>
               </w:rPr>
-              <w:t>notebooks/L3_baselines.py</w:t>
+              <w:t>src/leakage.py</w:t>
             </w:r>
             <w:r>
               <w:rPr>
@@ -4660,7 +4873,7 @@
                 <w:sz w:val="19"/>
                 <w:szCs w:val="19"/>
               </w:rPr>
-              <w:t>docs/explications/02_problematique.md</w:t>
+              <w:t>notebooks/L2_problematique.py</w:t>
             </w:r>
             <w:r>
               <w:rPr>
@@ -4676,7 +4889,14 @@
                 <w:sz w:val="19"/>
                 <w:szCs w:val="19"/>
               </w:rPr>
-              <w:t>03_baselines.md</w:t>
+              <w:t>02_problematique.md</w:t>
+            </w:r>
+            <w:r>
+              <w:rPr>
+                <w:sz w:val="19"/>
+                <w:szCs w:val="19"/>
+              </w:rPr>
+              <w:t>) pour le relire et le défendre</w:t>
             </w:r>
           </w:p>
         </w:tc>
@@ -4809,7 +5029,7 @@
       <w:pPr>
         <w:pStyle w:val="Heading2"/>
       </w:pPr>
-      <w:bookmarkStart w:id="8" w:name="_Toc244114164"/>
+      <w:bookmarkStart w:id="8" w:name="_Toc244114649"/>
       <w:r>
         <w:t>4.5 Ce que chacun doit fournir pour sa propre soutenance</w:t>
       </w:r>
@@ -4857,7 +5077,7 @@
       <w:pPr>
         <w:pStyle w:val="Heading1"/>
       </w:pPr>
-      <w:bookmarkStart w:id="9" w:name="_Toc244114165"/>
+      <w:bookmarkStart w:id="9" w:name="_Toc244114650"/>
       <w:r>
         <w:t>5. Répartition en un coup d'œil</w:t>
       </w:r>
@@ -5262,7 +5482,7 @@
                 <w:sz w:val="19"/>
                 <w:szCs w:val="19"/>
               </w:rPr>
-              <w:t>L2 (formulation, fuite), L3 (Ridge, LightGBM, SHAP), intervalles de confiance</w:t>
+              <w:t>L3 (Ridge, LightGBM, SHAP), intervalles de confiance ; L2 déjà fait, à s'approprier</w:t>
             </w:r>
           </w:p>
         </w:tc>
@@ -5809,7 +6029,7 @@
       <w:pPr>
         <w:pStyle w:val="Heading1"/>
       </w:pPr>
-      <w:bookmarkStart w:id="10" w:name="_Toc244114166"/>
+      <w:bookmarkStart w:id="10" w:name="_Toc244114651"/>
       <w:r>
         <w:t>6. Volet A — GNN et modèles neuronaux (Souhail, GPU)</w:t>
       </w:r>
@@ -6798,7 +7018,7 @@
       <w:pPr>
         <w:pStyle w:val="Heading1"/>
       </w:pPr>
-      <w:bookmarkStart w:id="11" w:name="_Toc244114167"/>
+      <w:bookmarkStart w:id="11" w:name="_Toc244114652"/>
       <w:r>
         <w:t>7. Volet B — Réseau, baselines analytiques et événements</w:t>
       </w:r>
@@ -7410,7 +7630,7 @@
       <w:pPr>
         <w:pStyle w:val="Heading1"/>
       </w:pPr>
-      <w:bookmarkStart w:id="12" w:name="_Toc244114168"/>
+      <w:bookmarkStart w:id="12" w:name="_Toc244114653"/>
       <w:r>
         <w:t>8. Volet C — Données, formulation et ML classique</w:t>
       </w:r>
@@ -7436,19 +7656,82 @@
         <w:pStyle w:val="Heading3"/>
       </w:pPr>
       <w:r>
-        <w:t>C1 — Formulation et preuve de la fuite (L2)</w:t>
-      </w:r>
-    </w:p>
-    <w:p>
-      <w:pPr>
-        <w:spacing w:after="40"/>
+        <w:t>C1 — Formulation et preuve de la fuite (L2) : déjà écrit, à s'approprier</w:t>
+      </w:r>
+    </w:p>
+    <w:p>
+      <w:pPr>
+        <w:spacing w:after="120" w:line="276" w:lineRule="auto"/>
       </w:pPr>
       <w:r>
         <w:rPr>
           <w:b/>
           <w:bCs/>
         </w:rPr>
-        <w:t>Quoi :</w:t>
+        <w:t>Fait :</w:t>
+      </w:r>
+      <w:r>
+        <w:t xml:space="preserve"> la formulation, les hypothèses H1 à H4, l'expérience de fuite (</w:t>
+      </w:r>
+      <w:r>
+        <w:rPr>
+          <w:rFonts w:ascii="Consolas" w:eastAsia="Consolas" w:hAnsi="Consolas" w:cs="Consolas"/>
+          <w:color w:val="7A2E0E"/>
+          <w:sz w:val="19"/>
+          <w:szCs w:val="19"/>
+        </w:rPr>
+        <w:t>python -m src.leakage</w:t>
+      </w:r>
+      <w:r>
+        <w:t xml:space="preserve">, 10 s), les figures </w:t>
+      </w:r>
+      <w:r>
+        <w:rPr>
+          <w:rFonts w:ascii="Consolas" w:eastAsia="Consolas" w:hAnsi="Consolas" w:cs="Consolas"/>
+          <w:color w:val="7A2E0E"/>
+          <w:sz w:val="19"/>
+          <w:szCs w:val="19"/>
+        </w:rPr>
+        <w:t>L2_01_fuite.png</w:t>
+      </w:r>
+      <w:r>
+        <w:t xml:space="preserve"> et </w:t>
+      </w:r>
+      <w:r>
+        <w:rPr>
+          <w:rFonts w:ascii="Consolas" w:eastAsia="Consolas" w:hAnsi="Consolas" w:cs="Consolas"/>
+          <w:color w:val="7A2E0E"/>
+          <w:sz w:val="19"/>
+          <w:szCs w:val="19"/>
+        </w:rPr>
+        <w:t>L2_02_splits.png</w:t>
+      </w:r>
+      <w:r>
+        <w:t xml:space="preserve">, le notebook L2 et </w:t>
+      </w:r>
+      <w:r>
+        <w:rPr>
+          <w:rFonts w:ascii="Consolas" w:eastAsia="Consolas" w:hAnsi="Consolas" w:cs="Consolas"/>
+          <w:color w:val="7A2E0E"/>
+          <w:sz w:val="19"/>
+          <w:szCs w:val="19"/>
+        </w:rPr>
+        <w:t>02_problematique.md</w:t>
+      </w:r>
+      <w:r>
+        <w:t>.</w:t>
+      </w:r>
+    </w:p>
+    <w:p>
+      <w:pPr>
+        <w:spacing w:after="40"/>
+      </w:pPr>
+      <w:r>
+        <w:rPr>
+          <w:b/>
+          <w:bCs/>
+        </w:rPr>
+        <w:t>À faire :</w:t>
       </w:r>
     </w:p>
     <w:p>
@@ -7461,7 +7744,19 @@
         <w:spacing w:after="60"/>
       </w:pPr>
       <w:r>
-        <w:t>Rédiger la formulation : tâche (régression de log10(délai) par flux), pourquoi c'est un problème de gestion de slices (modèle « what-if » pour l'admission et le dimensionnement), hypothèses H1 à H4 (voir annexe).</w:t>
+        <w:t xml:space="preserve">Relire le notebook et l'explication, relancer </w:t>
+      </w:r>
+      <w:r>
+        <w:rPr>
+          <w:rFonts w:ascii="Consolas" w:eastAsia="Consolas" w:hAnsi="Consolas" w:cs="Consolas"/>
+          <w:color w:val="7A2E0E"/>
+          <w:sz w:val="19"/>
+          <w:szCs w:val="19"/>
+        </w:rPr>
+        <w:t>python -m src.leakage</w:t>
+      </w:r>
+      <w:r>
+        <w:t xml:space="preserve"> et retrouver les mêmes chiffres.</w:t>
       </w:r>
     </w:p>
     <w:p>
@@ -7474,39 +7769,19 @@
         <w:spacing w:after="60"/>
       </w:pPr>
       <w:r>
-        <w:t xml:space="preserve">Expérience : sur 1 500 scénarios tirés du pool hors topologies retenues, réserver 20 % de scénarios « vraiment nouveaux » (E). Modèle A entraîné sur un split </w:t>
-      </w:r>
-      <w:r>
-        <w:rPr>
-          <w:b/>
-          <w:bCs/>
-        </w:rPr>
-        <w:t>aléatoire par flux</w:t>
-      </w:r>
-      <w:r>
-        <w:t xml:space="preserve">, modèle B sur un split </w:t>
-      </w:r>
-      <w:r>
-        <w:rPr>
-          <w:b/>
-          <w:bCs/>
-        </w:rPr>
-        <w:t>par scénario</w:t>
-      </w:r>
-      <w:r>
-        <w:t xml:space="preserve"> ; comparer l'erreur estimée par chaque split et l'erreur réelle sur E. Même LightGBM (paramètres fixes), </w:t>
-      </w:r>
-      <w:r>
-        <w:rPr>
-          <w:rFonts w:ascii="Consolas" w:eastAsia="Consolas" w:hAnsi="Consolas" w:cs="Consolas"/>
-          <w:color w:val="7A2E0E"/>
-          <w:sz w:val="19"/>
-          <w:szCs w:val="19"/>
-        </w:rPr>
-        <w:t>ALL_FEATURES</w:t>
-      </w:r>
-      <w:r>
-        <w:t>, 3 graines.</w:t>
+        <w:t xml:space="preserve">Pouvoir répondre seul aux questions de jury listées dans </w:t>
+      </w:r>
+      <w:r>
+        <w:rPr>
+          <w:rFonts w:ascii="Consolas" w:eastAsia="Consolas" w:hAnsi="Consolas" w:cs="Consolas"/>
+          <w:color w:val="7A2E0E"/>
+          <w:sz w:val="19"/>
+          <w:szCs w:val="19"/>
+        </w:rPr>
+        <w:t>02_problematique.md</w:t>
+      </w:r>
+      <w:r>
+        <w:t xml:space="preserve"> (pourquoi pas un split aléatoire, pourquoi les topologies inédites en premier, ce que le test inédit mesure vraiment).</w:t>
       </w:r>
     </w:p>
     <w:p>
@@ -7519,58 +7794,7 @@
         <w:spacing w:after="60"/>
       </w:pPr>
       <w:r>
-        <w:t>Rapporter l'écart tel qu'il est mesuré, même s'il est petit.</w:t>
-      </w:r>
-    </w:p>
-    <w:p>
-      <w:pPr>
-        <w:spacing w:after="120" w:line="276" w:lineRule="auto"/>
-      </w:pPr>
-      <w:r>
-        <w:rPr>
-          <w:b/>
-          <w:bCs/>
-        </w:rPr>
-        <w:t>Fini quand :</w:t>
-      </w:r>
-      <w:r>
-        <w:t xml:space="preserve"> </w:t>
-      </w:r>
-      <w:r>
-        <w:rPr>
-          <w:rFonts w:ascii="Consolas" w:eastAsia="Consolas" w:hAnsi="Consolas" w:cs="Consolas"/>
-          <w:color w:val="7A2E0E"/>
-          <w:sz w:val="19"/>
-          <w:szCs w:val="19"/>
-        </w:rPr>
-        <w:t>results/leakage_experiment.csv</w:t>
-      </w:r>
-      <w:r>
-        <w:t xml:space="preserve">, figure </w:t>
-      </w:r>
-      <w:r>
-        <w:rPr>
-          <w:rFonts w:ascii="Consolas" w:eastAsia="Consolas" w:hAnsi="Consolas" w:cs="Consolas"/>
-          <w:color w:val="7A2E0E"/>
-          <w:sz w:val="19"/>
-          <w:szCs w:val="19"/>
-        </w:rPr>
-        <w:t>L2_01_fuite.png</w:t>
-      </w:r>
-      <w:r>
-        <w:t xml:space="preserve">, notebook L2 et </w:t>
-      </w:r>
-      <w:r>
-        <w:rPr>
-          <w:rFonts w:ascii="Consolas" w:eastAsia="Consolas" w:hAnsi="Consolas" w:cs="Consolas"/>
-          <w:color w:val="7A2E0E"/>
-          <w:sz w:val="19"/>
-          <w:szCs w:val="19"/>
-        </w:rPr>
-        <w:t>02_problematique.md</w:t>
-      </w:r>
-      <w:r>
-        <w:t xml:space="preserve"> faits.</w:t>
+        <w:t>Optionnel : refaire l'expérience avec Ridge à la place de LightGBM pour voir si l'écart de fuite dépend du modèle.</w:t>
       </w:r>
     </w:p>
     <w:p>
@@ -7954,7 +8178,7 @@
       <w:pPr>
         <w:pStyle w:val="Heading1"/>
       </w:pPr>
-      <w:bookmarkStart w:id="13" w:name="_Toc244114169"/>
+      <w:bookmarkStart w:id="13" w:name="_Toc244114654"/>
       <w:r>
         <w:t>9. Déroulement et points de synchronisation</w:t>
       </w:r>
@@ -8299,7 +8523,7 @@
                 <w:sz w:val="19"/>
                 <w:szCs w:val="19"/>
               </w:rPr>
-              <w:t>C1 fuite + formulation, début C2</w:t>
+              <w:t>C1 s'approprier L2, C2 Ridge + LightGBM</w:t>
             </w:r>
           </w:p>
         </w:tc>
@@ -8758,7 +8982,7 @@
       <w:pPr>
         <w:pStyle w:val="Heading1"/>
       </w:pPr>
-      <w:bookmarkStart w:id="14" w:name="_Toc244114170"/>
+      <w:bookmarkStart w:id="14" w:name="_Toc244114655"/>
       <w:r>
         <w:t>10. Liste de contrôle avant de dire « fini »</w:t>
       </w:r>
@@ -10041,7 +10265,7 @@
       <w:pPr>
         <w:pStyle w:val="Heading1"/>
       </w:pPr>
-      <w:bookmarkStart w:id="15" w:name="_Toc244114171"/>
+      <w:bookmarkStart w:id="15" w:name="_Toc244114656"/>
       <w:r>
         <w:t>Annexe — Hypothèses à tester (rédigées en L2, tranchées en L6)</w:t>
       </w:r>
@@ -10799,10 +11023,10 @@
 <file path=word/numbering.xml><?xml version="1.0" encoding="utf-8"?>
 <w:numbering xmlns:wpc="http://schemas.microsoft.com/office/word/2010/wordprocessingCanvas" xmlns:cx="http://schemas.microsoft.com/office/drawing/2014/chartex" xmlns:cx1="http://schemas.microsoft.com/office/drawing/2015/9/8/chartex" xmlns:cx2="http://schemas.microsoft.com/office/drawing/2015/10/21/chartex" xmlns:cx3="http://schemas.microsoft.com/office/drawing/2016/5/9/chartex" xmlns:cx4="http://schemas.microsoft.com/office/drawing/2016/5/10/chartex" xmlns:cx5="http://schemas.microsoft.com/office/drawing/2016/5/11/chartex" xmlns:cx6="http://schemas.microsoft.com/office/drawing/2016/5/12/chartex" xmlns:cx7="http://schemas.microsoft.com/office/drawing/2016/5/13/chartex" xmlns:cx8="http://schemas.microsoft.com/office/drawing/2016/5/14/chartex" xmlns:mc="http://schemas.openxmlformats.org/markup-compatibility/2006" xmlns:aink="http://schemas.microsoft.com/office/drawing/2016/ink" xmlns:am3d="http://schemas.microsoft.com/office/drawing/2017/model3d" xmlns:o="urn:schemas-microsoft-com:office:office" xmlns:oel="http://schemas.microsoft.com/office/2019/extlst" xmlns:r="http://schemas.openxmlformats.org/officeDocument/2006/relationships" xmlns:m="http://schemas.openxmlformats.org/officeDocument/2006/math" xmlns:v="urn:schemas-microsoft-com:vml" xmlns:wp14="http://schemas.microsoft.com/office/word/2010/wordprocessingDrawing" xmlns:wp="http://schemas.openxmlformats.org/drawingml/2006/wordprocessingDrawing" xmlns:w10="urn:schemas-microsoft-com:office:word" xmlns:w="http://schemas.openxmlformats.org/wordprocessingml/2006/main" xmlns:w14="http://schemas.microsoft.com/office/word/2010/wordml" xmlns:w15="http://schemas.microsoft.com/office/word/2012/wordml" xmlns:w16cex="http://schemas.microsoft.com/office/word/2018/wordml/cex" xmlns:w16cid="http://schemas.microsoft.com/office/word/2016/wordml/cid" xmlns:w16="http://schemas.microsoft.com/office/word/2018/wordml" xmlns:w16du="http://schemas.microsoft.com/office/word/2023/wordml/word16du" xmlns:w16sdtdh="http://schemas.microsoft.com/office/word/2020/wordml/sdtdatahash" xmlns:w16sdtfl="http://schemas.microsoft.com/office/word/2024/wordml/sdtformatlock" xmlns:w16se="http://schemas.microsoft.com/office/word/2015/wordml/symex" xmlns:wpg="http://schemas.microsoft.com/office/word/2010/wordprocessingGroup" xmlns:wpi="http://schemas.microsoft.com/office/word/2010/wordprocessingInk" xmlns:wne="http://schemas.microsoft.com/office/word/2006/wordml" xmlns:wps="http://schemas.microsoft.com/office/word/2010/wordprocessingShape" mc:Ignorable="w14 w15 w16se w16cid w16 w16cex w16sdtdh w16sdtfl w16du wp14">
   <w:abstractNum w:abstractNumId="0" w15:restartNumberingAfterBreak="0">
-    <w:nsid w:val="03557F5A"/>
+    <w:nsid w:val="1F4253F2"/>
     <w:multiLevelType w:val="hybridMultilevel"/>
-    <w:tmpl w:val="D37CC1DC"/>
-    <w:lvl w:ilvl="0" w:tplc="A7D64E80">
+    <w:tmpl w:val="732E0A10"/>
+    <w:lvl w:ilvl="0" w:tplc="60B0A630">
       <w:start w:val="1"/>
       <w:numFmt w:val="decimal"/>
       <w:lvlText w:val="%1."/>
@@ -10811,52 +11035,52 @@
         <w:ind w:left="540" w:hanging="300"/>
       </w:pPr>
     </w:lvl>
-    <w:lvl w:ilvl="1" w:tplc="D592E1EE">
+    <w:lvl w:ilvl="1" w:tplc="1EFC1D88">
       <w:numFmt w:val="decimal"/>
       <w:lvlText w:val=""/>
       <w:lvlJc w:val="left"/>
     </w:lvl>
-    <w:lvl w:ilvl="2" w:tplc="0E80BD56">
+    <w:lvl w:ilvl="2" w:tplc="43F210D2">
       <w:numFmt w:val="decimal"/>
       <w:lvlText w:val=""/>
       <w:lvlJc w:val="left"/>
     </w:lvl>
-    <w:lvl w:ilvl="3" w:tplc="188AD39A">
+    <w:lvl w:ilvl="3" w:tplc="BCBC1864">
       <w:numFmt w:val="decimal"/>
       <w:lvlText w:val=""/>
       <w:lvlJc w:val="left"/>
     </w:lvl>
-    <w:lvl w:ilvl="4" w:tplc="6AB64AB6">
+    <w:lvl w:ilvl="4" w:tplc="005C329E">
       <w:numFmt w:val="decimal"/>
       <w:lvlText w:val=""/>
       <w:lvlJc w:val="left"/>
     </w:lvl>
-    <w:lvl w:ilvl="5" w:tplc="9ED00FC0">
+    <w:lvl w:ilvl="5" w:tplc="4E4AF14E">
       <w:numFmt w:val="decimal"/>
       <w:lvlText w:val=""/>
       <w:lvlJc w:val="left"/>
     </w:lvl>
-    <w:lvl w:ilvl="6" w:tplc="7584EE9A">
+    <w:lvl w:ilvl="6" w:tplc="D1A2CD74">
       <w:numFmt w:val="decimal"/>
       <w:lvlText w:val=""/>
       <w:lvlJc w:val="left"/>
     </w:lvl>
-    <w:lvl w:ilvl="7" w:tplc="1C74D92E">
+    <w:lvl w:ilvl="7" w:tplc="91B4251E">
       <w:numFmt w:val="decimal"/>
       <w:lvlText w:val=""/>
       <w:lvlJc w:val="left"/>
     </w:lvl>
-    <w:lvl w:ilvl="8" w:tplc="4B78B478">
+    <w:lvl w:ilvl="8" w:tplc="513270F2">
       <w:numFmt w:val="decimal"/>
       <w:lvlText w:val=""/>
       <w:lvlJc w:val="left"/>
     </w:lvl>
   </w:abstractNum>
   <w:abstractNum w:abstractNumId="1" w15:restartNumberingAfterBreak="0">
-    <w:nsid w:val="1A347AA2"/>
+    <w:nsid w:val="5BF51362"/>
     <w:multiLevelType w:val="hybridMultilevel"/>
-    <w:tmpl w:val="5BA42CBE"/>
-    <w:lvl w:ilvl="0" w:tplc="DEFC2E76">
+    <w:tmpl w:val="3E06DF5E"/>
+    <w:lvl w:ilvl="0" w:tplc="B2947CCC">
       <w:start w:val="1"/>
       <w:numFmt w:val="bullet"/>
       <w:lvlText w:val="●"/>
@@ -10865,7 +11089,7 @@
         <w:ind w:left="720" w:hanging="360"/>
       </w:pPr>
     </w:lvl>
-    <w:lvl w:ilvl="1" w:tplc="C0CE4394">
+    <w:lvl w:ilvl="1" w:tplc="FF6A2D68">
       <w:start w:val="1"/>
       <w:numFmt w:val="bullet"/>
       <w:lvlText w:val="○"/>
@@ -10874,7 +11098,7 @@
         <w:ind w:left="1440" w:hanging="360"/>
       </w:pPr>
     </w:lvl>
-    <w:lvl w:ilvl="2" w:tplc="1172B1A0">
+    <w:lvl w:ilvl="2" w:tplc="7EEEDF4E">
       <w:start w:val="1"/>
       <w:numFmt w:val="bullet"/>
       <w:lvlText w:val="■"/>
@@ -10883,7 +11107,7 @@
         <w:ind w:left="2160" w:hanging="360"/>
       </w:pPr>
     </w:lvl>
-    <w:lvl w:ilvl="3" w:tplc="F7D0790E">
+    <w:lvl w:ilvl="3" w:tplc="37401B76">
       <w:start w:val="1"/>
       <w:numFmt w:val="bullet"/>
       <w:lvlText w:val="●"/>
@@ -10892,7 +11116,7 @@
         <w:ind w:left="2880" w:hanging="360"/>
       </w:pPr>
     </w:lvl>
-    <w:lvl w:ilvl="4" w:tplc="B2CCEF38">
+    <w:lvl w:ilvl="4" w:tplc="06D69180">
       <w:start w:val="1"/>
       <w:numFmt w:val="bullet"/>
       <w:lvlText w:val="○"/>
@@ -10901,7 +11125,7 @@
         <w:ind w:left="3600" w:hanging="360"/>
       </w:pPr>
     </w:lvl>
-    <w:lvl w:ilvl="5" w:tplc="C65A1A86">
+    <w:lvl w:ilvl="5" w:tplc="49DCF238">
       <w:start w:val="1"/>
       <w:numFmt w:val="bullet"/>
       <w:lvlText w:val="■"/>
@@ -10910,7 +11134,7 @@
         <w:ind w:left="4320" w:hanging="360"/>
       </w:pPr>
     </w:lvl>
-    <w:lvl w:ilvl="6" w:tplc="FA008E8E">
+    <w:lvl w:ilvl="6" w:tplc="F1AC15F2">
       <w:start w:val="1"/>
       <w:numFmt w:val="bullet"/>
       <w:lvlText w:val="●"/>
@@ -10919,7 +11143,7 @@
         <w:ind w:left="5040" w:hanging="360"/>
       </w:pPr>
     </w:lvl>
-    <w:lvl w:ilvl="7" w:tplc="3EF460B8">
+    <w:lvl w:ilvl="7" w:tplc="299499B2">
       <w:start w:val="1"/>
       <w:numFmt w:val="bullet"/>
       <w:lvlText w:val="●"/>
@@ -10928,7 +11152,7 @@
         <w:ind w:left="5760" w:hanging="360"/>
       </w:pPr>
     </w:lvl>
-    <w:lvl w:ilvl="8" w:tplc="FD6E0BA0">
+    <w:lvl w:ilvl="8" w:tplc="C77EA000">
       <w:start w:val="1"/>
       <w:numFmt w:val="bullet"/>
       <w:lvlText w:val="●"/>
@@ -10939,131 +11163,131 @@
     </w:lvl>
   </w:abstractNum>
   <w:abstractNum w:abstractNumId="2" w15:restartNumberingAfterBreak="0">
-    <w:nsid w:val="3C1C3A6A"/>
+    <w:nsid w:val="66161EB6"/>
     <w:multiLevelType w:val="hybridMultilevel"/>
-    <w:tmpl w:val="5DDE80AA"/>
-    <w:lvl w:ilvl="0" w:tplc="59E8ABEE">
+    <w:tmpl w:val="C614A33C"/>
+    <w:lvl w:ilvl="0" w:tplc="AEC6627C">
       <w:start w:val="1"/>
-      <w:numFmt w:val="bullet"/>
-      <w:lvlText w:val="•"/>
+      <w:numFmt w:val="decimal"/>
+      <w:lvlText w:val="%1."/>
       <w:lvlJc w:val="left"/>
       <w:pPr>
-        <w:ind w:left="540" w:hanging="270"/>
+        <w:ind w:left="540" w:hanging="300"/>
       </w:pPr>
     </w:lvl>
-    <w:lvl w:ilvl="1" w:tplc="70A6040A">
-      <w:start w:val="1"/>
-      <w:numFmt w:val="bullet"/>
-      <w:lvlText w:val="–"/>
-      <w:lvlJc w:val="left"/>
-      <w:pPr>
-        <w:ind w:left="1000" w:hanging="270"/>
-      </w:pPr>
-    </w:lvl>
-    <w:lvl w:ilvl="2" w:tplc="4BCEA7E2">
+    <w:lvl w:ilvl="1" w:tplc="CDE8E80C">
       <w:numFmt w:val="decimal"/>
       <w:lvlText w:val=""/>
       <w:lvlJc w:val="left"/>
     </w:lvl>
-    <w:lvl w:ilvl="3" w:tplc="2B48DEAE">
+    <w:lvl w:ilvl="2" w:tplc="D01C4A3A">
       <w:numFmt w:val="decimal"/>
       <w:lvlText w:val=""/>
       <w:lvlJc w:val="left"/>
     </w:lvl>
-    <w:lvl w:ilvl="4" w:tplc="33BC1E9C">
+    <w:lvl w:ilvl="3" w:tplc="F2C63E0A">
       <w:numFmt w:val="decimal"/>
       <w:lvlText w:val=""/>
       <w:lvlJc w:val="left"/>
     </w:lvl>
-    <w:lvl w:ilvl="5" w:tplc="CB5045EE">
+    <w:lvl w:ilvl="4" w:tplc="4EC436E4">
       <w:numFmt w:val="decimal"/>
       <w:lvlText w:val=""/>
       <w:lvlJc w:val="left"/>
     </w:lvl>
-    <w:lvl w:ilvl="6" w:tplc="3856A320">
+    <w:lvl w:ilvl="5" w:tplc="563826A8">
       <w:numFmt w:val="decimal"/>
       <w:lvlText w:val=""/>
       <w:lvlJc w:val="left"/>
     </w:lvl>
-    <w:lvl w:ilvl="7" w:tplc="8B4C75C8">
+    <w:lvl w:ilvl="6" w:tplc="6F188D98">
       <w:numFmt w:val="decimal"/>
       <w:lvlText w:val=""/>
       <w:lvlJc w:val="left"/>
     </w:lvl>
-    <w:lvl w:ilvl="8" w:tplc="DDC2E1CE">
+    <w:lvl w:ilvl="7" w:tplc="62048832">
+      <w:numFmt w:val="decimal"/>
+      <w:lvlText w:val=""/>
+      <w:lvlJc w:val="left"/>
+    </w:lvl>
+    <w:lvl w:ilvl="8" w:tplc="8A185D42">
       <w:numFmt w:val="decimal"/>
       <w:lvlText w:val=""/>
       <w:lvlJc w:val="left"/>
     </w:lvl>
   </w:abstractNum>
   <w:abstractNum w:abstractNumId="3" w15:restartNumberingAfterBreak="0">
-    <w:nsid w:val="7CF341E1"/>
+    <w:nsid w:val="67880AC0"/>
     <w:multiLevelType w:val="hybridMultilevel"/>
-    <w:tmpl w:val="3C6EC5C6"/>
-    <w:lvl w:ilvl="0" w:tplc="B00A0222">
+    <w:tmpl w:val="4CBAFFEC"/>
+    <w:lvl w:ilvl="0" w:tplc="C7EAD78A">
       <w:start w:val="1"/>
-      <w:numFmt w:val="decimal"/>
-      <w:lvlText w:val="%1."/>
+      <w:numFmt w:val="bullet"/>
+      <w:lvlText w:val="•"/>
       <w:lvlJc w:val="left"/>
       <w:pPr>
-        <w:ind w:left="540" w:hanging="300"/>
+        <w:ind w:left="540" w:hanging="270"/>
       </w:pPr>
     </w:lvl>
-    <w:lvl w:ilvl="1" w:tplc="1AA0C73C">
+    <w:lvl w:ilvl="1" w:tplc="778A57B4">
+      <w:start w:val="1"/>
+      <w:numFmt w:val="bullet"/>
+      <w:lvlText w:val="–"/>
+      <w:lvlJc w:val="left"/>
+      <w:pPr>
+        <w:ind w:left="1000" w:hanging="270"/>
+      </w:pPr>
+    </w:lvl>
+    <w:lvl w:ilvl="2" w:tplc="20140A90">
       <w:numFmt w:val="decimal"/>
       <w:lvlText w:val=""/>
       <w:lvlJc w:val="left"/>
     </w:lvl>
-    <w:lvl w:ilvl="2" w:tplc="C144F6DE">
+    <w:lvl w:ilvl="3" w:tplc="808C05F2">
       <w:numFmt w:val="decimal"/>
       <w:lvlText w:val=""/>
       <w:lvlJc w:val="left"/>
     </w:lvl>
-    <w:lvl w:ilvl="3" w:tplc="4C585C7A">
+    <w:lvl w:ilvl="4" w:tplc="7FA68A16">
       <w:numFmt w:val="decimal"/>
       <w:lvlText w:val=""/>
       <w:lvlJc w:val="left"/>
     </w:lvl>
-    <w:lvl w:ilvl="4" w:tplc="10FC054C">
+    <w:lvl w:ilvl="5" w:tplc="0EEA9282">
       <w:numFmt w:val="decimal"/>
       <w:lvlText w:val=""/>
       <w:lvlJc w:val="left"/>
     </w:lvl>
-    <w:lvl w:ilvl="5" w:tplc="9B467924">
+    <w:lvl w:ilvl="6" w:tplc="FEA6D2F4">
       <w:numFmt w:val="decimal"/>
       <w:lvlText w:val=""/>
       <w:lvlJc w:val="left"/>
     </w:lvl>
-    <w:lvl w:ilvl="6" w:tplc="CC3A5308">
+    <w:lvl w:ilvl="7" w:tplc="9A66A21E">
       <w:numFmt w:val="decimal"/>
       <w:lvlText w:val=""/>
       <w:lvlJc w:val="left"/>
     </w:lvl>
-    <w:lvl w:ilvl="7" w:tplc="CEA08908">
-      <w:numFmt w:val="decimal"/>
-      <w:lvlText w:val=""/>
-      <w:lvlJc w:val="left"/>
-    </w:lvl>
-    <w:lvl w:ilvl="8" w:tplc="59929F68">
+    <w:lvl w:ilvl="8" w:tplc="D9B6B0B0">
       <w:numFmt w:val="decimal"/>
       <w:lvlText w:val=""/>
       <w:lvlJc w:val="left"/>
     </w:lvl>
   </w:abstractNum>
-  <w:num w:numId="1" w16cid:durableId="404107741">
+  <w:num w:numId="1" w16cid:durableId="1865482368">
     <w:abstractNumId w:val="1"/>
     <w:lvlOverride w:ilvl="0">
       <w:startOverride w:val="1"/>
     </w:lvlOverride>
   </w:num>
-  <w:num w:numId="2" w16cid:durableId="174811815">
-    <w:abstractNumId w:val="3"/>
+  <w:num w:numId="2" w16cid:durableId="7677170">
+    <w:abstractNumId w:val="0"/>
     <w:lvlOverride w:ilvl="0">
       <w:startOverride w:val="1"/>
     </w:lvlOverride>
   </w:num>
-  <w:num w:numId="3" w16cid:durableId="1784879168">
-    <w:abstractNumId w:val="2"/>
+  <w:num w:numId="3" w16cid:durableId="232862306">
+    <w:abstractNumId w:val="3"/>
     <w:lvlOverride w:ilvl="0">
       <w:startOverride w:val="1"/>
     </w:lvlOverride>
@@ -11652,7 +11876,7 @@
     <w:autoRedefine/>
     <w:uiPriority w:val="39"/>
     <w:unhideWhenUsed/>
-    <w:rsid w:val="004000C8"/>
+    <w:rsid w:val="00765EC0"/>
     <w:pPr>
       <w:spacing w:after="100"/>
     </w:pPr>
@@ -11664,7 +11888,7 @@
     <w:autoRedefine/>
     <w:uiPriority w:val="39"/>
     <w:unhideWhenUsed/>
-    <w:rsid w:val="004000C8"/>
+    <w:rsid w:val="00765EC0"/>
     <w:pPr>
       <w:spacing w:after="100"/>
       <w:ind w:left="210"/>

</xml_diff>